<commit_message>
Add DocBeginDate в wordEngine and fixing RHController
</commit_message>
<xml_diff>
--- a/RightholderWorkplace/Templates/F_DOGOVIR-NA-UPRAVLINNYA-PRAVAMI-Avtora-2018-1_.docx
+++ b/RightholderWorkplace/Templates/F_DOGOVIR-NA-UPRAVLINNYA-PRAVAMI-Avtora-2018-1_.docx
@@ -135,6 +135,7 @@
       <w:sdt>
         <w:sdtPr>
           <w:rPr>
+            <w:b/>
             <w:sz w:val="28"/>
             <w:szCs w:val="28"/>
           </w:rPr>
@@ -212,12 +213,13 @@
       <w:sdt>
         <w:sdtPr>
           <w:rPr>
+            <w:b/>
             <w:sz w:val="28"/>
             <w:szCs w:val="28"/>
             <w:lang w:val="uk-UA"/>
           </w:rPr>
-          <w:alias w:val="docDateBegin "/>
-          <w:tag w:val="docDateBegin "/>
+          <w:alias w:val="docDate"/>
+          <w:tag w:val="docDate"/>
           <w:id w:val="-541976329"/>
           <w:placeholder>
             <w:docPart w:val="EE6A686066A4478B98541DE0ED01880D"/>
@@ -434,10 +436,9 @@
     <w:sdt>
       <w:sdtPr>
         <w:rPr>
-          <w:rFonts w:ascii="Calibri" w:hAnsi="Calibri" w:cs="Calibri"/>
-          <w:color w:val="FF0000"/>
-          <w:sz w:val="16"/>
-          <w:szCs w:val="16"/>
+          <w:b/>
+          <w:sz w:val="28"/>
+          <w:szCs w:val="28"/>
           <w:lang w:val="en-US"/>
         </w:rPr>
         <w:alias w:val="СstName"/>
@@ -458,10 +459,8 @@
             <w:spacing w:after="0" w:line="240" w:lineRule="auto"/>
             <w:jc w:val="center"/>
             <w:rPr>
-              <w:rFonts w:ascii="Calibri" w:hAnsi="Calibri" w:cs="Calibri"/>
-              <w:color w:val="FF0000"/>
-              <w:sz w:val="16"/>
-              <w:szCs w:val="16"/>
+              <w:sz w:val="28"/>
+              <w:szCs w:val="28"/>
             </w:rPr>
           </w:pPr>
           <w:r>
@@ -1041,6 +1040,7 @@
       <w:sdt>
         <w:sdtPr>
           <w:rPr>
+            <w:b/>
             <w:sz w:val="22"/>
             <w:szCs w:val="22"/>
             <w:lang w:val="uk-UA"/>
@@ -1114,6 +1114,7 @@
       <w:sdt>
         <w:sdtPr>
           <w:rPr>
+            <w:b/>
             <w:sz w:val="22"/>
             <w:szCs w:val="22"/>
             <w:lang w:val="uk-UA"/>
@@ -2052,6 +2053,7 @@
           <w:docPartGallery w:val="Tables"/>
         </w:docPartList>
       </w:sdtPr>
+      <w:sdtEndPr/>
       <w:sdtContent>
         <w:p>
           <w:pPr>
@@ -2086,10 +2088,7 @@
                 <w:pPr>
                   <w:pStyle w:val="ae"/>
                   <w:rPr>
-                    <w:rFonts w:ascii="Calibri" w:eastAsiaTheme="minorHAnsi" w:hAnsi="Calibri" w:cs="Calibri"/>
-                    <w:color w:val="002060"/>
-                    <w:sz w:val="16"/>
-                    <w:szCs w:val="16"/>
+                    <w:rFonts w:eastAsiaTheme="minorHAnsi"/>
                     <w:lang w:eastAsia="en-US"/>
                   </w:rPr>
                 </w:pPr>
@@ -2229,6 +2228,7 @@
           <w:docPartGallery w:val="Tables"/>
         </w:docPartList>
       </w:sdtPr>
+      <w:sdtEndPr/>
       <w:sdtContent>
         <w:p>
           <w:pPr>
@@ -2266,11 +2266,8 @@
                   <w:ind w:left="0" w:right="-40"/>
                   <w:jc w:val="both"/>
                   <w:rPr>
-                    <w:b/>
-                    <w:i/>
                     <w:sz w:val="20"/>
                     <w:szCs w:val="20"/>
-                    <w:u w:val="single"/>
                     <w:lang w:val="uk-UA"/>
                   </w:rPr>
                 </w:pPr>
@@ -2346,8 +2343,6 @@
         <w:t>:</w:t>
       </w:r>
     </w:p>
-    <w:bookmarkStart w:id="1" w:name="_GoBack" w:displacedByCustomXml="next"/>
-    <w:bookmarkEnd w:id="1" w:displacedByCustomXml="next"/>
     <w:sdt>
       <w:sdtPr>
         <w:rPr>
@@ -2368,6 +2363,7 @@
           <w:docPartGallery w:val="Tables"/>
         </w:docPartList>
       </w:sdtPr>
+      <w:sdtEndPr/>
       <w:sdtContent>
         <w:p>
           <w:pPr>
@@ -2406,7 +2402,6 @@
                   <w:ind w:left="0"/>
                   <w:jc w:val="center"/>
                   <w:rPr>
-                    <w:i/>
                     <w:color w:val="000000"/>
                     <w:sz w:val="20"/>
                     <w:szCs w:val="20"/>
@@ -4547,7 +4542,7 @@
           <w:lang w:val="uk-UA"/>
         </w:rPr>
       </w:pPr>
-      <w:bookmarkStart w:id="2" w:name="_Ref346109396"/>
+      <w:bookmarkStart w:id="1" w:name="_Ref346109396"/>
       <w:r>
         <w:rPr>
           <w:sz w:val="22"/>
@@ -4694,9 +4689,25 @@
           <w:szCs w:val="22"/>
           <w:lang w:val="uk-UA"/>
         </w:rPr>
-        <w:t xml:space="preserve"> від сум, </w:t>
-      </w:r>
-      <w:bookmarkEnd w:id="2"/>
+        <w:t xml:space="preserve"> </w:t>
+      </w:r>
+      <w:r>
+        <w:rPr>
+          <w:sz w:val="22"/>
+          <w:szCs w:val="22"/>
+          <w:lang w:val="uk-UA"/>
+        </w:rPr>
+        <w:t xml:space="preserve">% </w:t>
+      </w:r>
+      <w:r>
+        <w:rPr>
+          <w:sz w:val="22"/>
+          <w:szCs w:val="22"/>
+          <w:lang w:val="uk-UA"/>
+        </w:rPr>
+        <w:t xml:space="preserve">від сум, </w:t>
+      </w:r>
+      <w:bookmarkEnd w:id="1"/>
       <w:r>
         <w:rPr>
           <w:sz w:val="22"/>
@@ -4922,7 +4933,24 @@
           <w:szCs w:val="22"/>
           <w:lang w:val="uk-UA"/>
         </w:rPr>
-        <w:t xml:space="preserve"> від суми авторської винагороди, зібраної за таке використання.</w:t>
+        <w:t xml:space="preserve"> </w:t>
+      </w:r>
+      <w:r>
+        <w:rPr>
+          <w:sz w:val="22"/>
+          <w:szCs w:val="22"/>
+          <w:lang w:val="uk-UA"/>
+        </w:rPr>
+        <w:t xml:space="preserve">% </w:t>
+      </w:r>
+      <w:r>
+        <w:rPr>
+          <w:color w:val="000000"/>
+          <w:sz w:val="22"/>
+          <w:szCs w:val="22"/>
+          <w:lang w:val="uk-UA"/>
+        </w:rPr>
+        <w:t>від суми авторської винагороди, зібраної за таке використання.</w:t>
       </w:r>
     </w:p>
     <w:p>
@@ -6621,9 +6649,10 @@
           <w:sdt>
             <w:sdtPr>
               <w:rPr>
+                <w:b/>
                 <w:color w:val="000000"/>
-                <w:sz w:val="16"/>
-                <w:szCs w:val="16"/>
+                <w:sz w:val="20"/>
+                <w:szCs w:val="20"/>
                 <w:lang w:val="uk-UA"/>
               </w:rPr>
               <w:alias w:val="СstName"/>
@@ -6643,8 +6672,8 @@
                   <w:jc w:val="center"/>
                   <w:rPr>
                     <w:color w:val="000000"/>
-                    <w:sz w:val="16"/>
-                    <w:szCs w:val="16"/>
+                    <w:sz w:val="18"/>
+                    <w:szCs w:val="18"/>
                     <w:lang w:val="uk-UA"/>
                   </w:rPr>
                 </w:pPr>
@@ -6667,6 +6696,8 @@
                 <w:lang w:val="uk-UA"/>
               </w:rPr>
             </w:pPr>
+            <w:bookmarkStart w:id="2" w:name="_GoBack"/>
+            <w:bookmarkEnd w:id="2"/>
           </w:p>
           <w:p>
             <w:pPr>
@@ -6720,6 +6751,8 @@
                   <w:rPr>
                     <w:rStyle w:val="af9"/>
                     <w:rFonts w:eastAsiaTheme="minorHAnsi"/>
+                    <w:sz w:val="18"/>
+                    <w:szCs w:val="18"/>
                   </w:rPr>
                   <w:t>Место для ввода текста.</w:t>
                 </w:r>
@@ -6777,6 +6810,8 @@
                   <w:rPr>
                     <w:rStyle w:val="af9"/>
                     <w:rFonts w:eastAsiaTheme="minorHAnsi"/>
+                    <w:sz w:val="18"/>
+                    <w:szCs w:val="18"/>
                   </w:rPr>
                   <w:t>Место для ввода текста.</w:t>
                 </w:r>
@@ -6825,6 +6860,8 @@
                   <w:rPr>
                     <w:rStyle w:val="af9"/>
                     <w:rFonts w:eastAsiaTheme="minorHAnsi"/>
+                    <w:sz w:val="18"/>
+                    <w:szCs w:val="18"/>
                   </w:rPr>
                   <w:t>Место для ввода текста.</w:t>
                 </w:r>
@@ -6890,6 +6927,8 @@
                   <w:rPr>
                     <w:rStyle w:val="af9"/>
                     <w:rFonts w:eastAsiaTheme="minorHAnsi"/>
+                    <w:sz w:val="18"/>
+                    <w:szCs w:val="18"/>
                   </w:rPr>
                   <w:t>Место для ввода текста.</w:t>
                 </w:r>
@@ -6947,6 +6986,8 @@
                   <w:rPr>
                     <w:rStyle w:val="af9"/>
                     <w:rFonts w:eastAsiaTheme="minorHAnsi"/>
+                    <w:sz w:val="18"/>
+                    <w:szCs w:val="18"/>
                   </w:rPr>
                   <w:t>Место для ввода текста.</w:t>
                 </w:r>
@@ -7012,6 +7053,8 @@
                   <w:rPr>
                     <w:rStyle w:val="af9"/>
                     <w:rFonts w:eastAsiaTheme="minorHAnsi"/>
+                    <w:sz w:val="18"/>
+                    <w:szCs w:val="18"/>
                   </w:rPr>
                   <w:t>Место для ввода текста.</w:t>
                 </w:r>
@@ -7098,6 +7141,8 @@
                   <w:rPr>
                     <w:rStyle w:val="af9"/>
                     <w:rFonts w:eastAsiaTheme="minorHAnsi"/>
+                    <w:sz w:val="18"/>
+                    <w:szCs w:val="18"/>
                   </w:rPr>
                   <w:t>Место для ввода текста.</w:t>
                 </w:r>
@@ -7156,6 +7201,8 @@
                   <w:rPr>
                     <w:rStyle w:val="af9"/>
                     <w:rFonts w:eastAsiaTheme="minorHAnsi"/>
+                    <w:sz w:val="18"/>
+                    <w:szCs w:val="18"/>
                   </w:rPr>
                   <w:t>Место для ввода текста.</w:t>
                 </w:r>
@@ -7165,8 +7212,8 @@
               <w:rPr>
                 <w:rFonts w:ascii="Calibri" w:hAnsi="Calibri" w:cs="Calibri"/>
                 <w:color w:val="FF0000"/>
-                <w:sz w:val="16"/>
-                <w:szCs w:val="16"/>
+                <w:sz w:val="18"/>
+                <w:szCs w:val="18"/>
                 <w:lang w:val="uk-UA"/>
               </w:rPr>
               <w:t xml:space="preserve"> </w:t>
@@ -7213,6 +7260,8 @@
                   <w:rPr>
                     <w:rStyle w:val="af9"/>
                     <w:rFonts w:eastAsiaTheme="minorHAnsi"/>
+                    <w:sz w:val="18"/>
+                    <w:szCs w:val="18"/>
                   </w:rPr>
                   <w:t>Место для ввода текста.</w:t>
                 </w:r>
@@ -7289,6 +7338,8 @@
                   <w:rPr>
                     <w:rStyle w:val="af9"/>
                     <w:rFonts w:eastAsiaTheme="minorHAnsi"/>
+                    <w:sz w:val="18"/>
+                    <w:szCs w:val="18"/>
                   </w:rPr>
                   <w:t>Место для ввода текста.</w:t>
                 </w:r>
@@ -7356,6 +7407,8 @@
                   <w:rPr>
                     <w:rStyle w:val="af9"/>
                     <w:rFonts w:eastAsiaTheme="minorHAnsi"/>
+                    <w:sz w:val="18"/>
+                    <w:szCs w:val="18"/>
                   </w:rPr>
                   <w:t>Место для ввода текста.</w:t>
                 </w:r>
@@ -7433,6 +7486,8 @@
                   <w:rPr>
                     <w:rStyle w:val="af9"/>
                     <w:rFonts w:eastAsiaTheme="minorHAnsi"/>
+                    <w:sz w:val="18"/>
+                    <w:szCs w:val="18"/>
                   </w:rPr>
                   <w:t>Место для ввода текста.</w:t>
                 </w:r>
@@ -7481,11 +7536,17 @@
               <w:t>.):</w:t>
             </w:r>
             <w:r>
+              <w:rPr>
+                <w:sz w:val="18"/>
+                <w:szCs w:val="18"/>
+              </w:rPr>
               <w:t xml:space="preserve"> </w:t>
             </w:r>
             <w:sdt>
               <w:sdtPr>
                 <w:rPr>
+                  <w:sz w:val="18"/>
+                  <w:szCs w:val="18"/>
                   <w:lang w:val="en-US"/>
                 </w:rPr>
                 <w:alias w:val="СstPhone"/>
@@ -7504,6 +7565,8 @@
                   <w:rPr>
                     <w:rStyle w:val="af9"/>
                     <w:rFonts w:eastAsiaTheme="minorHAnsi"/>
+                    <w:sz w:val="18"/>
+                    <w:szCs w:val="18"/>
                   </w:rPr>
                   <w:t>Место для ввода текста.</w:t>
                 </w:r>
@@ -7552,7 +7615,7 @@
                 <w:tag w:val="СstPhoneWork"/>
                 <w:id w:val="739369011"/>
                 <w:placeholder>
-                  <w:docPart w:val="DefaultPlaceholder_-1854013440"/>
+                  <w:docPart w:val="B427A4E7FE4E481ABC0FD7A111803A2A"/>
                 </w:placeholder>
                 <w:showingPlcHdr/>
                 <w15:appearance w15:val="tags"/>
@@ -7564,6 +7627,8 @@
                   <w:rPr>
                     <w:rStyle w:val="af9"/>
                     <w:rFonts w:eastAsiaTheme="minorHAnsi"/>
+                    <w:sz w:val="18"/>
+                    <w:szCs w:val="18"/>
                   </w:rPr>
                   <w:t>Место для ввода текста.</w:t>
                 </w:r>
@@ -7641,7 +7706,7 @@
                 <w:tag w:val="СstEmail"/>
                 <w:id w:val="-318652928"/>
                 <w:placeholder>
-                  <w:docPart w:val="DefaultPlaceholder_-1854013440"/>
+                  <w:docPart w:val="41F2BDAC22994746AACFB1BB7423863C"/>
                 </w:placeholder>
                 <w:showingPlcHdr/>
                 <w15:appearance w15:val="tags"/>
@@ -7653,6 +7718,8 @@
                   <w:rPr>
                     <w:rStyle w:val="af9"/>
                     <w:rFonts w:eastAsiaTheme="minorHAnsi"/>
+                    <w:sz w:val="18"/>
+                    <w:szCs w:val="18"/>
                   </w:rPr>
                   <w:t>Место для ввода текста.</w:t>
                 </w:r>
@@ -7734,7 +7801,6 @@
                 <w:szCs w:val="18"/>
                 <w:lang w:val="uk-UA"/>
               </w:rPr>
-              <w:lastRenderedPageBreak/>
               <w:t xml:space="preserve">                  (підпис)</w:t>
             </w:r>
             <w:r>
@@ -7774,7 +7840,6 @@
           <w:szCs w:val="20"/>
           <w:lang w:val="uk-UA"/>
         </w:rPr>
-        <w:lastRenderedPageBreak/>
         <w:t>С</w:t>
       </w:r>
       <w:r>
@@ -10876,32 +10941,6 @@
   <w:docParts>
     <w:docPart>
       <w:docPartPr>
-        <w:name w:val="DefaultPlaceholder_-1854013440"/>
-        <w:category>
-          <w:name w:val="Общие"/>
-          <w:gallery w:val="placeholder"/>
-        </w:category>
-        <w:types>
-          <w:type w:val="bbPlcHdr"/>
-        </w:types>
-        <w:behaviors>
-          <w:behavior w:val="content"/>
-        </w:behaviors>
-        <w:guid w:val="{118228A4-573F-4E48-AF80-2332862882B5}"/>
-      </w:docPartPr>
-      <w:docPartBody>
-        <w:p>
-          <w:r>
-            <w:rPr>
-              <w:rStyle w:val="a3"/>
-            </w:rPr>
-            <w:t>Место для ввода текста.</w:t>
-          </w:r>
-        </w:p>
-      </w:docPartBody>
-    </w:docPart>
-    <w:docPart>
-      <w:docPartPr>
         <w:name w:val="7000F3773B5D45598E24BE2A206B0CB6"/>
         <w:category>
           <w:name w:val="Общие"/>
@@ -10918,7 +10957,7 @@
       <w:docPartBody>
         <w:p>
           <w:pPr>
-            <w:pStyle w:val="7000F3773B5D45598E24BE2A206B0CB61"/>
+            <w:pStyle w:val="7000F3773B5D45598E24BE2A206B0CB63"/>
           </w:pPr>
           <w:r>
             <w:rPr>
@@ -10948,7 +10987,7 @@
       <w:docPartBody>
         <w:p>
           <w:pPr>
-            <w:pStyle w:val="EE6A686066A4478B98541DE0ED01880D1"/>
+            <w:pStyle w:val="EE6A686066A4478B98541DE0ED01880D3"/>
           </w:pPr>
           <w:r>
             <w:rPr>
@@ -10978,7 +11017,7 @@
       <w:docPartBody>
         <w:p>
           <w:pPr>
-            <w:pStyle w:val="98518950C15044288EB55986CD0239E91"/>
+            <w:pStyle w:val="98518950C15044288EB55986CD0239E93"/>
           </w:pPr>
           <w:r>
             <w:rPr>
@@ -11008,7 +11047,7 @@
       <w:docPartBody>
         <w:p>
           <w:pPr>
-            <w:pStyle w:val="DFE4253A826A41CB86C331DD4083B1041"/>
+            <w:pStyle w:val="DFE4253A826A41CB86C331DD4083B1043"/>
           </w:pPr>
           <w:r>
             <w:rPr>
@@ -11038,7 +11077,7 @@
       <w:docPartBody>
         <w:p>
           <w:pPr>
-            <w:pStyle w:val="79042A016C5A407A9E7DD96D7EC4B9381"/>
+            <w:pStyle w:val="79042A016C5A407A9E7DD96D7EC4B9383"/>
           </w:pPr>
           <w:r>
             <w:rPr>
@@ -11068,7 +11107,7 @@
       <w:docPartBody>
         <w:p>
           <w:pPr>
-            <w:pStyle w:val="51EF8E6C5B744057A17BC75C120E1F20"/>
+            <w:pStyle w:val="51EF8E6C5B744057A17BC75C120E1F202"/>
           </w:pPr>
           <w:r>
             <w:rPr>
@@ -11098,7 +11137,7 @@
       <w:docPartBody>
         <w:p>
           <w:pPr>
-            <w:pStyle w:val="6644C4ECF492402DB7F2BA9B6748E878"/>
+            <w:pStyle w:val="6644C4ECF492402DB7F2BA9B6748E8782"/>
           </w:pPr>
           <w:r>
             <w:rPr>
@@ -11128,7 +11167,7 @@
       <w:docPartBody>
         <w:p>
           <w:pPr>
-            <w:pStyle w:val="C02B5CE2A98843C7A134DC3C1BECBCB3"/>
+            <w:pStyle w:val="C02B5CE2A98843C7A134DC3C1BECBCB32"/>
           </w:pPr>
           <w:r>
             <w:rPr>
@@ -11158,7 +11197,7 @@
       <w:docPartBody>
         <w:p>
           <w:pPr>
-            <w:pStyle w:val="F08CB367DF454DEDA5E6E09941FD86C6"/>
+            <w:pStyle w:val="F08CB367DF454DEDA5E6E09941FD86C62"/>
           </w:pPr>
           <w:r>
             <w:rPr>
@@ -11188,7 +11227,7 @@
       <w:docPartBody>
         <w:p>
           <w:pPr>
-            <w:pStyle w:val="30B5231132DE4C44B87DC8A4A77312F8"/>
+            <w:pStyle w:val="30B5231132DE4C44B87DC8A4A77312F82"/>
           </w:pPr>
           <w:r>
             <w:rPr>
@@ -11218,7 +11257,7 @@
       <w:docPartBody>
         <w:p>
           <w:pPr>
-            <w:pStyle w:val="641844EF88A0483585C42633FB27E147"/>
+            <w:pStyle w:val="641844EF88A0483585C42633FB27E1472"/>
           </w:pPr>
           <w:r>
             <w:rPr>
@@ -11248,7 +11287,7 @@
       <w:docPartBody>
         <w:p>
           <w:pPr>
-            <w:pStyle w:val="11C5206171604150A0F0E34E3DB6DB7C"/>
+            <w:pStyle w:val="11C5206171604150A0F0E34E3DB6DB7C2"/>
           </w:pPr>
           <w:r>
             <w:rPr>
@@ -11278,7 +11317,7 @@
       <w:docPartBody>
         <w:p>
           <w:pPr>
-            <w:pStyle w:val="24D557F4BD1F4680AF94C4A866494157"/>
+            <w:pStyle w:val="24D557F4BD1F4680AF94C4A8664941572"/>
           </w:pPr>
           <w:r>
             <w:rPr>
@@ -11308,7 +11347,7 @@
       <w:docPartBody>
         <w:p>
           <w:pPr>
-            <w:pStyle w:val="F2031ECA10CA432EAFAFCC13CBD26CA1"/>
+            <w:pStyle w:val="F2031ECA10CA432EAFAFCC13CBD26CA12"/>
           </w:pPr>
           <w:r>
             <w:rPr>
@@ -11338,7 +11377,7 @@
       <w:docPartBody>
         <w:p>
           <w:pPr>
-            <w:pStyle w:val="F6D2CF914FB545CFAF75D2C668297D5A"/>
+            <w:pStyle w:val="F6D2CF914FB545CFAF75D2C668297D5A2"/>
           </w:pPr>
           <w:r>
             <w:rPr>
@@ -11368,7 +11407,7 @@
       <w:docPartBody>
         <w:p>
           <w:pPr>
-            <w:pStyle w:val="9E9A8FC7DA374C97938206616E58A544"/>
+            <w:pStyle w:val="9E9A8FC7DA374C97938206616E58A5442"/>
           </w:pPr>
           <w:r>
             <w:rPr>
@@ -11398,7 +11437,7 @@
       <w:docPartBody>
         <w:p>
           <w:pPr>
-            <w:pStyle w:val="D569733F90D8465780AAFEA9A72292CC"/>
+            <w:pStyle w:val="D569733F90D8465780AAFEA9A72292CC2"/>
           </w:pPr>
           <w:r>
             <w:rPr>
@@ -11428,7 +11467,7 @@
       <w:docPartBody>
         <w:p>
           <w:pPr>
-            <w:pStyle w:val="A424099D39AD4CE8A3386ED4CCAB1C51"/>
+            <w:pStyle w:val="A424099D39AD4CE8A3386ED4CCAB1C512"/>
           </w:pPr>
           <w:r>
             <w:rPr>
@@ -11458,7 +11497,7 @@
       <w:docPartBody>
         <w:p>
           <w:pPr>
-            <w:pStyle w:val="1C25BBCB9E8C458DB55945E1653B7B60"/>
+            <w:pStyle w:val="1C25BBCB9E8C458DB55945E1653B7B602"/>
           </w:pPr>
           <w:r>
             <w:rPr>
@@ -11488,7 +11527,7 @@
       <w:docPartBody>
         <w:p>
           <w:pPr>
-            <w:pStyle w:val="C4D8D8EBF8FB4F208FCCE4F22312AE58"/>
+            <w:pStyle w:val="C4D8D8EBF8FB4F208FCCE4F22312AE582"/>
           </w:pPr>
           <w:r>
             <w:rPr>
@@ -11518,7 +11557,7 @@
       <w:docPartBody>
         <w:p>
           <w:pPr>
-            <w:pStyle w:val="334026C924924B0F8F30D585C3574F7F"/>
+            <w:pStyle w:val="334026C924924B0F8F30D585C3574F7F2"/>
           </w:pPr>
           <w:r>
             <w:rPr>
@@ -11548,7 +11587,7 @@
       <w:docPartBody>
         <w:p>
           <w:pPr>
-            <w:pStyle w:val="7ADE624015B146EC945C11081BCEF5B1"/>
+            <w:pStyle w:val="7ADE624015B146EC945C11081BCEF5B12"/>
           </w:pPr>
           <w:r>
             <w:rPr>
@@ -11578,7 +11617,7 @@
       <w:docPartBody>
         <w:p>
           <w:pPr>
-            <w:pStyle w:val="E25F84A56559403AB6E70300BAAE0997"/>
+            <w:pStyle w:val="E25F84A56559403AB6E70300BAAE09972"/>
           </w:pPr>
           <w:r>
             <w:rPr>
@@ -11612,6 +11651,66 @@
               <w:rStyle w:val="a3"/>
             </w:rPr>
             <w:t>Выберите стандартный блок.</w:t>
+          </w:r>
+        </w:p>
+      </w:docPartBody>
+    </w:docPart>
+    <w:docPart>
+      <w:docPartPr>
+        <w:name w:val="B427A4E7FE4E481ABC0FD7A111803A2A"/>
+        <w:category>
+          <w:name w:val="Общие"/>
+          <w:gallery w:val="placeholder"/>
+        </w:category>
+        <w:types>
+          <w:type w:val="bbPlcHdr"/>
+        </w:types>
+        <w:behaviors>
+          <w:behavior w:val="content"/>
+        </w:behaviors>
+        <w:guid w:val="{BFAAAC68-9908-40BD-B602-84B3D1538F7C}"/>
+      </w:docPartPr>
+      <w:docPartBody>
+        <w:p>
+          <w:pPr>
+            <w:pStyle w:val="B427A4E7FE4E481ABC0FD7A111803A2A1"/>
+          </w:pPr>
+          <w:r>
+            <w:rPr>
+              <w:rStyle w:val="a3"/>
+              <w:rFonts w:eastAsiaTheme="minorHAnsi"/>
+            </w:rPr>
+            <w:t>Место для ввода текста.</w:t>
+          </w:r>
+        </w:p>
+      </w:docPartBody>
+    </w:docPart>
+    <w:docPart>
+      <w:docPartPr>
+        <w:name w:val="41F2BDAC22994746AACFB1BB7423863C"/>
+        <w:category>
+          <w:name w:val="Общие"/>
+          <w:gallery w:val="placeholder"/>
+        </w:category>
+        <w:types>
+          <w:type w:val="bbPlcHdr"/>
+        </w:types>
+        <w:behaviors>
+          <w:behavior w:val="content"/>
+        </w:behaviors>
+        <w:guid w:val="{EB10C279-C1DA-46C6-BE53-6FDFD3E8FC9D}"/>
+      </w:docPartPr>
+      <w:docPartBody>
+        <w:p>
+          <w:pPr>
+            <w:pStyle w:val="41F2BDAC22994746AACFB1BB7423863C1"/>
+          </w:pPr>
+          <w:r>
+            <w:rPr>
+              <w:rStyle w:val="a3"/>
+              <w:rFonts w:eastAsiaTheme="minorHAnsi"/>
+            </w:rPr>
+            <w:t>Место для ввода текста.</w:t>
           </w:r>
         </w:p>
       </w:docPartBody>
@@ -11700,7 +11799,12 @@
     <w:rsid w:val="004405D4"/>
     <w:rsid w:val="005C0A2F"/>
     <w:rsid w:val="00736CB2"/>
+    <w:rsid w:val="00A046BF"/>
     <w:rsid w:val="00B10511"/>
+    <w:rsid w:val="00C5361F"/>
+    <w:rsid w:val="00ED17BD"/>
+    <w:rsid w:val="00F8621F"/>
+    <w:rsid w:val="00FE3AF7"/>
   </w:rsids>
   <m:mathPr>
     <m:mathFont m:val="Cambria Math"/>
@@ -12153,7 +12257,7 @@
     <w:basedOn w:val="a0"/>
     <w:uiPriority w:val="99"/>
     <w:semiHidden/>
-    <w:rsid w:val="00B10511"/>
+    <w:rsid w:val="00C5361F"/>
     <w:rPr>
       <w:color w:val="808080"/>
     </w:rPr>
@@ -12554,6 +12658,714 @@
       <w:lang w:eastAsia="ar-SA"/>
     </w:rPr>
   </w:style>
+  <w:style w:type="paragraph" w:customStyle="1" w:styleId="7000F3773B5D45598E24BE2A206B0CB62">
+    <w:name w:val="7000F3773B5D45598E24BE2A206B0CB62"/>
+    <w:rsid w:val="00ED17BD"/>
+    <w:pPr>
+      <w:suppressAutoHyphens/>
+      <w:spacing w:after="120" w:line="480" w:lineRule="auto"/>
+    </w:pPr>
+    <w:rPr>
+      <w:rFonts w:ascii="Times New Roman" w:eastAsia="Times New Roman" w:hAnsi="Times New Roman" w:cs="Times New Roman"/>
+      <w:sz w:val="24"/>
+      <w:szCs w:val="24"/>
+      <w:lang w:eastAsia="ar-SA"/>
+    </w:rPr>
+  </w:style>
+  <w:style w:type="paragraph" w:customStyle="1" w:styleId="EE6A686066A4478B98541DE0ED01880D2">
+    <w:name w:val="EE6A686066A4478B98541DE0ED01880D2"/>
+    <w:rsid w:val="00ED17BD"/>
+    <w:pPr>
+      <w:suppressAutoHyphens/>
+      <w:spacing w:after="120" w:line="480" w:lineRule="auto"/>
+    </w:pPr>
+    <w:rPr>
+      <w:rFonts w:ascii="Times New Roman" w:eastAsia="Times New Roman" w:hAnsi="Times New Roman" w:cs="Times New Roman"/>
+      <w:sz w:val="24"/>
+      <w:szCs w:val="24"/>
+      <w:lang w:eastAsia="ar-SA"/>
+    </w:rPr>
+  </w:style>
+  <w:style w:type="paragraph" w:customStyle="1" w:styleId="98518950C15044288EB55986CD0239E92">
+    <w:name w:val="98518950C15044288EB55986CD0239E92"/>
+    <w:rsid w:val="00ED17BD"/>
+    <w:pPr>
+      <w:suppressAutoHyphens/>
+      <w:spacing w:after="120" w:line="480" w:lineRule="auto"/>
+    </w:pPr>
+    <w:rPr>
+      <w:rFonts w:ascii="Times New Roman" w:eastAsia="Times New Roman" w:hAnsi="Times New Roman" w:cs="Times New Roman"/>
+      <w:sz w:val="24"/>
+      <w:szCs w:val="24"/>
+      <w:lang w:eastAsia="ar-SA"/>
+    </w:rPr>
+  </w:style>
+  <w:style w:type="paragraph" w:customStyle="1" w:styleId="DFE4253A826A41CB86C331DD4083B1042">
+    <w:name w:val="DFE4253A826A41CB86C331DD4083B1042"/>
+    <w:rsid w:val="00ED17BD"/>
+    <w:pPr>
+      <w:suppressAutoHyphens/>
+      <w:spacing w:after="120" w:line="480" w:lineRule="auto"/>
+    </w:pPr>
+    <w:rPr>
+      <w:rFonts w:ascii="Times New Roman" w:eastAsia="Times New Roman" w:hAnsi="Times New Roman" w:cs="Times New Roman"/>
+      <w:sz w:val="24"/>
+      <w:szCs w:val="24"/>
+      <w:lang w:eastAsia="ar-SA"/>
+    </w:rPr>
+  </w:style>
+  <w:style w:type="paragraph" w:customStyle="1" w:styleId="79042A016C5A407A9E7DD96D7EC4B9382">
+    <w:name w:val="79042A016C5A407A9E7DD96D7EC4B9382"/>
+    <w:rsid w:val="00ED17BD"/>
+    <w:pPr>
+      <w:suppressAutoHyphens/>
+      <w:spacing w:after="120" w:line="480" w:lineRule="auto"/>
+    </w:pPr>
+    <w:rPr>
+      <w:rFonts w:ascii="Times New Roman" w:eastAsia="Times New Roman" w:hAnsi="Times New Roman" w:cs="Times New Roman"/>
+      <w:sz w:val="24"/>
+      <w:szCs w:val="24"/>
+      <w:lang w:eastAsia="ar-SA"/>
+    </w:rPr>
+  </w:style>
+  <w:style w:type="paragraph" w:customStyle="1" w:styleId="51EF8E6C5B744057A17BC75C120E1F201">
+    <w:name w:val="51EF8E6C5B744057A17BC75C120E1F201"/>
+    <w:rsid w:val="00ED17BD"/>
+    <w:pPr>
+      <w:suppressAutoHyphens/>
+      <w:spacing w:after="0" w:line="240" w:lineRule="auto"/>
+      <w:ind w:left="720"/>
+    </w:pPr>
+    <w:rPr>
+      <w:rFonts w:ascii="Times New Roman" w:eastAsia="Times New Roman" w:hAnsi="Times New Roman" w:cs="Times New Roman"/>
+      <w:sz w:val="24"/>
+      <w:szCs w:val="24"/>
+      <w:lang w:eastAsia="ar-SA"/>
+    </w:rPr>
+  </w:style>
+  <w:style w:type="paragraph" w:customStyle="1" w:styleId="6644C4ECF492402DB7F2BA9B6748E8781">
+    <w:name w:val="6644C4ECF492402DB7F2BA9B6748E8781"/>
+    <w:rsid w:val="00ED17BD"/>
+    <w:pPr>
+      <w:suppressAutoHyphens/>
+      <w:spacing w:after="0" w:line="240" w:lineRule="auto"/>
+      <w:ind w:left="720"/>
+    </w:pPr>
+    <w:rPr>
+      <w:rFonts w:ascii="Times New Roman" w:eastAsia="Times New Roman" w:hAnsi="Times New Roman" w:cs="Times New Roman"/>
+      <w:sz w:val="24"/>
+      <w:szCs w:val="24"/>
+      <w:lang w:eastAsia="ar-SA"/>
+    </w:rPr>
+  </w:style>
+  <w:style w:type="paragraph" w:customStyle="1" w:styleId="C02B5CE2A98843C7A134DC3C1BECBCB31">
+    <w:name w:val="C02B5CE2A98843C7A134DC3C1BECBCB31"/>
+    <w:rsid w:val="00ED17BD"/>
+    <w:pPr>
+      <w:suppressAutoHyphens/>
+      <w:spacing w:after="0" w:line="240" w:lineRule="auto"/>
+      <w:ind w:left="720"/>
+    </w:pPr>
+    <w:rPr>
+      <w:rFonts w:ascii="Times New Roman" w:eastAsia="Times New Roman" w:hAnsi="Times New Roman" w:cs="Times New Roman"/>
+      <w:sz w:val="24"/>
+      <w:szCs w:val="24"/>
+      <w:lang w:eastAsia="ar-SA"/>
+    </w:rPr>
+  </w:style>
+  <w:style w:type="paragraph" w:customStyle="1" w:styleId="F08CB367DF454DEDA5E6E09941FD86C61">
+    <w:name w:val="F08CB367DF454DEDA5E6E09941FD86C61"/>
+    <w:rsid w:val="00ED17BD"/>
+    <w:pPr>
+      <w:suppressAutoHyphens/>
+      <w:spacing w:after="0" w:line="240" w:lineRule="auto"/>
+      <w:ind w:left="720"/>
+    </w:pPr>
+    <w:rPr>
+      <w:rFonts w:ascii="Times New Roman" w:eastAsia="Times New Roman" w:hAnsi="Times New Roman" w:cs="Times New Roman"/>
+      <w:sz w:val="24"/>
+      <w:szCs w:val="24"/>
+      <w:lang w:eastAsia="ar-SA"/>
+    </w:rPr>
+  </w:style>
+  <w:style w:type="paragraph" w:customStyle="1" w:styleId="30B5231132DE4C44B87DC8A4A77312F81">
+    <w:name w:val="30B5231132DE4C44B87DC8A4A77312F81"/>
+    <w:rsid w:val="00ED17BD"/>
+    <w:pPr>
+      <w:suppressAutoHyphens/>
+      <w:spacing w:after="0" w:line="240" w:lineRule="auto"/>
+    </w:pPr>
+    <w:rPr>
+      <w:rFonts w:ascii="Times New Roman" w:eastAsia="Times New Roman" w:hAnsi="Times New Roman" w:cs="Times New Roman"/>
+      <w:sz w:val="24"/>
+      <w:szCs w:val="24"/>
+      <w:lang w:eastAsia="ar-SA"/>
+    </w:rPr>
+  </w:style>
+  <w:style w:type="paragraph" w:customStyle="1" w:styleId="641844EF88A0483585C42633FB27E1471">
+    <w:name w:val="641844EF88A0483585C42633FB27E1471"/>
+    <w:rsid w:val="00ED17BD"/>
+    <w:pPr>
+      <w:suppressAutoHyphens/>
+      <w:spacing w:after="0" w:line="240" w:lineRule="auto"/>
+    </w:pPr>
+    <w:rPr>
+      <w:rFonts w:ascii="Times New Roman" w:eastAsia="Times New Roman" w:hAnsi="Times New Roman" w:cs="Times New Roman"/>
+      <w:sz w:val="24"/>
+      <w:szCs w:val="24"/>
+      <w:lang w:eastAsia="ar-SA"/>
+    </w:rPr>
+  </w:style>
+  <w:style w:type="paragraph" w:customStyle="1" w:styleId="11C5206171604150A0F0E34E3DB6DB7C1">
+    <w:name w:val="11C5206171604150A0F0E34E3DB6DB7C1"/>
+    <w:rsid w:val="00ED17BD"/>
+    <w:pPr>
+      <w:suppressAutoHyphens/>
+      <w:spacing w:after="0" w:line="240" w:lineRule="auto"/>
+    </w:pPr>
+    <w:rPr>
+      <w:rFonts w:ascii="Times New Roman" w:eastAsia="Times New Roman" w:hAnsi="Times New Roman" w:cs="Times New Roman"/>
+      <w:sz w:val="24"/>
+      <w:szCs w:val="24"/>
+      <w:lang w:eastAsia="ar-SA"/>
+    </w:rPr>
+  </w:style>
+  <w:style w:type="paragraph" w:customStyle="1" w:styleId="24D557F4BD1F4680AF94C4A8664941571">
+    <w:name w:val="24D557F4BD1F4680AF94C4A8664941571"/>
+    <w:rsid w:val="00ED17BD"/>
+    <w:pPr>
+      <w:suppressAutoHyphens/>
+      <w:spacing w:after="0" w:line="240" w:lineRule="auto"/>
+    </w:pPr>
+    <w:rPr>
+      <w:rFonts w:ascii="Times New Roman" w:eastAsia="Times New Roman" w:hAnsi="Times New Roman" w:cs="Times New Roman"/>
+      <w:sz w:val="24"/>
+      <w:szCs w:val="24"/>
+      <w:lang w:eastAsia="ar-SA"/>
+    </w:rPr>
+  </w:style>
+  <w:style w:type="paragraph" w:customStyle="1" w:styleId="F2031ECA10CA432EAFAFCC13CBD26CA11">
+    <w:name w:val="F2031ECA10CA432EAFAFCC13CBD26CA11"/>
+    <w:rsid w:val="00ED17BD"/>
+    <w:pPr>
+      <w:suppressAutoHyphens/>
+      <w:spacing w:after="0" w:line="240" w:lineRule="auto"/>
+    </w:pPr>
+    <w:rPr>
+      <w:rFonts w:ascii="Times New Roman" w:eastAsia="Times New Roman" w:hAnsi="Times New Roman" w:cs="Times New Roman"/>
+      <w:sz w:val="24"/>
+      <w:szCs w:val="24"/>
+      <w:lang w:eastAsia="ar-SA"/>
+    </w:rPr>
+  </w:style>
+  <w:style w:type="paragraph" w:customStyle="1" w:styleId="F6D2CF914FB545CFAF75D2C668297D5A1">
+    <w:name w:val="F6D2CF914FB545CFAF75D2C668297D5A1"/>
+    <w:rsid w:val="00ED17BD"/>
+    <w:pPr>
+      <w:suppressAutoHyphens/>
+      <w:spacing w:after="0" w:line="240" w:lineRule="auto"/>
+    </w:pPr>
+    <w:rPr>
+      <w:rFonts w:ascii="Times New Roman" w:eastAsia="Times New Roman" w:hAnsi="Times New Roman" w:cs="Times New Roman"/>
+      <w:sz w:val="24"/>
+      <w:szCs w:val="24"/>
+      <w:lang w:eastAsia="ar-SA"/>
+    </w:rPr>
+  </w:style>
+  <w:style w:type="paragraph" w:customStyle="1" w:styleId="9E9A8FC7DA374C97938206616E58A5441">
+    <w:name w:val="9E9A8FC7DA374C97938206616E58A5441"/>
+    <w:rsid w:val="00ED17BD"/>
+    <w:pPr>
+      <w:suppressAutoHyphens/>
+      <w:spacing w:after="0" w:line="240" w:lineRule="auto"/>
+    </w:pPr>
+    <w:rPr>
+      <w:rFonts w:ascii="Times New Roman" w:eastAsia="Times New Roman" w:hAnsi="Times New Roman" w:cs="Times New Roman"/>
+      <w:sz w:val="24"/>
+      <w:szCs w:val="24"/>
+      <w:lang w:eastAsia="ar-SA"/>
+    </w:rPr>
+  </w:style>
+  <w:style w:type="paragraph" w:customStyle="1" w:styleId="D569733F90D8465780AAFEA9A72292CC1">
+    <w:name w:val="D569733F90D8465780AAFEA9A72292CC1"/>
+    <w:rsid w:val="00ED17BD"/>
+    <w:pPr>
+      <w:suppressAutoHyphens/>
+      <w:spacing w:after="0" w:line="240" w:lineRule="auto"/>
+    </w:pPr>
+    <w:rPr>
+      <w:rFonts w:ascii="Times New Roman" w:eastAsia="Times New Roman" w:hAnsi="Times New Roman" w:cs="Times New Roman"/>
+      <w:sz w:val="24"/>
+      <w:szCs w:val="24"/>
+      <w:lang w:eastAsia="ar-SA"/>
+    </w:rPr>
+  </w:style>
+  <w:style w:type="paragraph" w:customStyle="1" w:styleId="A424099D39AD4CE8A3386ED4CCAB1C511">
+    <w:name w:val="A424099D39AD4CE8A3386ED4CCAB1C511"/>
+    <w:rsid w:val="00ED17BD"/>
+    <w:pPr>
+      <w:suppressAutoHyphens/>
+      <w:spacing w:after="0" w:line="240" w:lineRule="auto"/>
+    </w:pPr>
+    <w:rPr>
+      <w:rFonts w:ascii="Times New Roman" w:eastAsia="Times New Roman" w:hAnsi="Times New Roman" w:cs="Times New Roman"/>
+      <w:sz w:val="24"/>
+      <w:szCs w:val="24"/>
+      <w:lang w:eastAsia="ar-SA"/>
+    </w:rPr>
+  </w:style>
+  <w:style w:type="paragraph" w:customStyle="1" w:styleId="1C25BBCB9E8C458DB55945E1653B7B601">
+    <w:name w:val="1C25BBCB9E8C458DB55945E1653B7B601"/>
+    <w:rsid w:val="00ED17BD"/>
+    <w:pPr>
+      <w:suppressAutoHyphens/>
+      <w:spacing w:after="0" w:line="240" w:lineRule="auto"/>
+    </w:pPr>
+    <w:rPr>
+      <w:rFonts w:ascii="Times New Roman" w:eastAsia="Times New Roman" w:hAnsi="Times New Roman" w:cs="Times New Roman"/>
+      <w:sz w:val="24"/>
+      <w:szCs w:val="24"/>
+      <w:lang w:eastAsia="ar-SA"/>
+    </w:rPr>
+  </w:style>
+  <w:style w:type="paragraph" w:customStyle="1" w:styleId="C4D8D8EBF8FB4F208FCCE4F22312AE581">
+    <w:name w:val="C4D8D8EBF8FB4F208FCCE4F22312AE581"/>
+    <w:rsid w:val="00ED17BD"/>
+    <w:pPr>
+      <w:suppressAutoHyphens/>
+      <w:spacing w:after="0" w:line="240" w:lineRule="auto"/>
+    </w:pPr>
+    <w:rPr>
+      <w:rFonts w:ascii="Times New Roman" w:eastAsia="Times New Roman" w:hAnsi="Times New Roman" w:cs="Times New Roman"/>
+      <w:sz w:val="24"/>
+      <w:szCs w:val="24"/>
+      <w:lang w:eastAsia="ar-SA"/>
+    </w:rPr>
+  </w:style>
+  <w:style w:type="paragraph" w:customStyle="1" w:styleId="334026C924924B0F8F30D585C3574F7F1">
+    <w:name w:val="334026C924924B0F8F30D585C3574F7F1"/>
+    <w:rsid w:val="00ED17BD"/>
+    <w:pPr>
+      <w:suppressAutoHyphens/>
+      <w:spacing w:after="0" w:line="240" w:lineRule="auto"/>
+    </w:pPr>
+    <w:rPr>
+      <w:rFonts w:ascii="Times New Roman" w:eastAsia="Times New Roman" w:hAnsi="Times New Roman" w:cs="Times New Roman"/>
+      <w:sz w:val="24"/>
+      <w:szCs w:val="24"/>
+      <w:lang w:eastAsia="ar-SA"/>
+    </w:rPr>
+  </w:style>
+  <w:style w:type="paragraph" w:customStyle="1" w:styleId="7ADE624015B146EC945C11081BCEF5B11">
+    <w:name w:val="7ADE624015B146EC945C11081BCEF5B11"/>
+    <w:rsid w:val="00ED17BD"/>
+    <w:pPr>
+      <w:suppressAutoHyphens/>
+      <w:spacing w:after="0" w:line="240" w:lineRule="auto"/>
+    </w:pPr>
+    <w:rPr>
+      <w:rFonts w:ascii="Times New Roman" w:eastAsia="Times New Roman" w:hAnsi="Times New Roman" w:cs="Times New Roman"/>
+      <w:sz w:val="24"/>
+      <w:szCs w:val="24"/>
+      <w:lang w:eastAsia="ar-SA"/>
+    </w:rPr>
+  </w:style>
+  <w:style w:type="paragraph" w:customStyle="1" w:styleId="E25F84A56559403AB6E70300BAAE09971">
+    <w:name w:val="E25F84A56559403AB6E70300BAAE09971"/>
+    <w:rsid w:val="00ED17BD"/>
+    <w:pPr>
+      <w:suppressAutoHyphens/>
+      <w:spacing w:after="0" w:line="240" w:lineRule="auto"/>
+    </w:pPr>
+    <w:rPr>
+      <w:rFonts w:ascii="Times New Roman" w:eastAsia="Times New Roman" w:hAnsi="Times New Roman" w:cs="Times New Roman"/>
+      <w:sz w:val="24"/>
+      <w:szCs w:val="24"/>
+      <w:lang w:eastAsia="ar-SA"/>
+    </w:rPr>
+  </w:style>
+  <w:style w:type="paragraph" w:customStyle="1" w:styleId="B427A4E7FE4E481ABC0FD7A111803A2A">
+    <w:name w:val="B427A4E7FE4E481ABC0FD7A111803A2A"/>
+    <w:rsid w:val="00ED17BD"/>
+    <w:pPr>
+      <w:suppressAutoHyphens/>
+      <w:spacing w:after="0" w:line="240" w:lineRule="auto"/>
+    </w:pPr>
+    <w:rPr>
+      <w:rFonts w:ascii="Times New Roman" w:eastAsia="Times New Roman" w:hAnsi="Times New Roman" w:cs="Times New Roman"/>
+      <w:sz w:val="24"/>
+      <w:szCs w:val="24"/>
+      <w:lang w:eastAsia="ar-SA"/>
+    </w:rPr>
+  </w:style>
+  <w:style w:type="paragraph" w:customStyle="1" w:styleId="41F2BDAC22994746AACFB1BB7423863C">
+    <w:name w:val="41F2BDAC22994746AACFB1BB7423863C"/>
+    <w:rsid w:val="00ED17BD"/>
+    <w:pPr>
+      <w:suppressAutoHyphens/>
+      <w:spacing w:after="0" w:line="240" w:lineRule="auto"/>
+    </w:pPr>
+    <w:rPr>
+      <w:rFonts w:ascii="Times New Roman" w:eastAsia="Times New Roman" w:hAnsi="Times New Roman" w:cs="Times New Roman"/>
+      <w:sz w:val="24"/>
+      <w:szCs w:val="24"/>
+      <w:lang w:eastAsia="ar-SA"/>
+    </w:rPr>
+  </w:style>
+  <w:style w:type="paragraph" w:customStyle="1" w:styleId="7000F3773B5D45598E24BE2A206B0CB63">
+    <w:name w:val="7000F3773B5D45598E24BE2A206B0CB63"/>
+    <w:rsid w:val="00C5361F"/>
+    <w:pPr>
+      <w:suppressAutoHyphens/>
+      <w:spacing w:after="120" w:line="480" w:lineRule="auto"/>
+    </w:pPr>
+    <w:rPr>
+      <w:rFonts w:ascii="Times New Roman" w:eastAsia="Times New Roman" w:hAnsi="Times New Roman" w:cs="Times New Roman"/>
+      <w:sz w:val="24"/>
+      <w:szCs w:val="24"/>
+      <w:lang w:eastAsia="ar-SA"/>
+    </w:rPr>
+  </w:style>
+  <w:style w:type="paragraph" w:customStyle="1" w:styleId="EE6A686066A4478B98541DE0ED01880D3">
+    <w:name w:val="EE6A686066A4478B98541DE0ED01880D3"/>
+    <w:rsid w:val="00C5361F"/>
+    <w:pPr>
+      <w:suppressAutoHyphens/>
+      <w:spacing w:after="120" w:line="480" w:lineRule="auto"/>
+    </w:pPr>
+    <w:rPr>
+      <w:rFonts w:ascii="Times New Roman" w:eastAsia="Times New Roman" w:hAnsi="Times New Roman" w:cs="Times New Roman"/>
+      <w:sz w:val="24"/>
+      <w:szCs w:val="24"/>
+      <w:lang w:eastAsia="ar-SA"/>
+    </w:rPr>
+  </w:style>
+  <w:style w:type="paragraph" w:customStyle="1" w:styleId="98518950C15044288EB55986CD0239E93">
+    <w:name w:val="98518950C15044288EB55986CD0239E93"/>
+    <w:rsid w:val="00C5361F"/>
+    <w:pPr>
+      <w:suppressAutoHyphens/>
+      <w:spacing w:after="120" w:line="480" w:lineRule="auto"/>
+    </w:pPr>
+    <w:rPr>
+      <w:rFonts w:ascii="Times New Roman" w:eastAsia="Times New Roman" w:hAnsi="Times New Roman" w:cs="Times New Roman"/>
+      <w:sz w:val="24"/>
+      <w:szCs w:val="24"/>
+      <w:lang w:eastAsia="ar-SA"/>
+    </w:rPr>
+  </w:style>
+  <w:style w:type="paragraph" w:customStyle="1" w:styleId="DFE4253A826A41CB86C331DD4083B1043">
+    <w:name w:val="DFE4253A826A41CB86C331DD4083B1043"/>
+    <w:rsid w:val="00C5361F"/>
+    <w:pPr>
+      <w:suppressAutoHyphens/>
+      <w:spacing w:after="120" w:line="480" w:lineRule="auto"/>
+    </w:pPr>
+    <w:rPr>
+      <w:rFonts w:ascii="Times New Roman" w:eastAsia="Times New Roman" w:hAnsi="Times New Roman" w:cs="Times New Roman"/>
+      <w:sz w:val="24"/>
+      <w:szCs w:val="24"/>
+      <w:lang w:eastAsia="ar-SA"/>
+    </w:rPr>
+  </w:style>
+  <w:style w:type="paragraph" w:customStyle="1" w:styleId="79042A016C5A407A9E7DD96D7EC4B9383">
+    <w:name w:val="79042A016C5A407A9E7DD96D7EC4B9383"/>
+    <w:rsid w:val="00C5361F"/>
+    <w:pPr>
+      <w:suppressAutoHyphens/>
+      <w:spacing w:after="120" w:line="480" w:lineRule="auto"/>
+    </w:pPr>
+    <w:rPr>
+      <w:rFonts w:ascii="Times New Roman" w:eastAsia="Times New Roman" w:hAnsi="Times New Roman" w:cs="Times New Roman"/>
+      <w:sz w:val="24"/>
+      <w:szCs w:val="24"/>
+      <w:lang w:eastAsia="ar-SA"/>
+    </w:rPr>
+  </w:style>
+  <w:style w:type="paragraph" w:customStyle="1" w:styleId="51EF8E6C5B744057A17BC75C120E1F202">
+    <w:name w:val="51EF8E6C5B744057A17BC75C120E1F202"/>
+    <w:rsid w:val="00C5361F"/>
+    <w:pPr>
+      <w:suppressAutoHyphens/>
+      <w:spacing w:after="0" w:line="240" w:lineRule="auto"/>
+      <w:ind w:left="720"/>
+    </w:pPr>
+    <w:rPr>
+      <w:rFonts w:ascii="Times New Roman" w:eastAsia="Times New Roman" w:hAnsi="Times New Roman" w:cs="Times New Roman"/>
+      <w:sz w:val="24"/>
+      <w:szCs w:val="24"/>
+      <w:lang w:eastAsia="ar-SA"/>
+    </w:rPr>
+  </w:style>
+  <w:style w:type="paragraph" w:customStyle="1" w:styleId="6644C4ECF492402DB7F2BA9B6748E8782">
+    <w:name w:val="6644C4ECF492402DB7F2BA9B6748E8782"/>
+    <w:rsid w:val="00C5361F"/>
+    <w:pPr>
+      <w:suppressAutoHyphens/>
+      <w:spacing w:after="0" w:line="240" w:lineRule="auto"/>
+      <w:ind w:left="720"/>
+    </w:pPr>
+    <w:rPr>
+      <w:rFonts w:ascii="Times New Roman" w:eastAsia="Times New Roman" w:hAnsi="Times New Roman" w:cs="Times New Roman"/>
+      <w:sz w:val="24"/>
+      <w:szCs w:val="24"/>
+      <w:lang w:eastAsia="ar-SA"/>
+    </w:rPr>
+  </w:style>
+  <w:style w:type="paragraph" w:customStyle="1" w:styleId="C02B5CE2A98843C7A134DC3C1BECBCB32">
+    <w:name w:val="C02B5CE2A98843C7A134DC3C1BECBCB32"/>
+    <w:rsid w:val="00C5361F"/>
+    <w:pPr>
+      <w:suppressAutoHyphens/>
+      <w:spacing w:after="0" w:line="240" w:lineRule="auto"/>
+      <w:ind w:left="720"/>
+    </w:pPr>
+    <w:rPr>
+      <w:rFonts w:ascii="Times New Roman" w:eastAsia="Times New Roman" w:hAnsi="Times New Roman" w:cs="Times New Roman"/>
+      <w:sz w:val="24"/>
+      <w:szCs w:val="24"/>
+      <w:lang w:eastAsia="ar-SA"/>
+    </w:rPr>
+  </w:style>
+  <w:style w:type="paragraph" w:customStyle="1" w:styleId="F08CB367DF454DEDA5E6E09941FD86C62">
+    <w:name w:val="F08CB367DF454DEDA5E6E09941FD86C62"/>
+    <w:rsid w:val="00C5361F"/>
+    <w:pPr>
+      <w:suppressAutoHyphens/>
+      <w:spacing w:after="0" w:line="240" w:lineRule="auto"/>
+      <w:ind w:left="720"/>
+    </w:pPr>
+    <w:rPr>
+      <w:rFonts w:ascii="Times New Roman" w:eastAsia="Times New Roman" w:hAnsi="Times New Roman" w:cs="Times New Roman"/>
+      <w:sz w:val="24"/>
+      <w:szCs w:val="24"/>
+      <w:lang w:eastAsia="ar-SA"/>
+    </w:rPr>
+  </w:style>
+  <w:style w:type="paragraph" w:customStyle="1" w:styleId="30B5231132DE4C44B87DC8A4A77312F82">
+    <w:name w:val="30B5231132DE4C44B87DC8A4A77312F82"/>
+    <w:rsid w:val="00C5361F"/>
+    <w:pPr>
+      <w:suppressAutoHyphens/>
+      <w:spacing w:after="0" w:line="240" w:lineRule="auto"/>
+    </w:pPr>
+    <w:rPr>
+      <w:rFonts w:ascii="Times New Roman" w:eastAsia="Times New Roman" w:hAnsi="Times New Roman" w:cs="Times New Roman"/>
+      <w:sz w:val="24"/>
+      <w:szCs w:val="24"/>
+      <w:lang w:eastAsia="ar-SA"/>
+    </w:rPr>
+  </w:style>
+  <w:style w:type="paragraph" w:customStyle="1" w:styleId="641844EF88A0483585C42633FB27E1472">
+    <w:name w:val="641844EF88A0483585C42633FB27E1472"/>
+    <w:rsid w:val="00C5361F"/>
+    <w:pPr>
+      <w:suppressAutoHyphens/>
+      <w:spacing w:after="0" w:line="240" w:lineRule="auto"/>
+    </w:pPr>
+    <w:rPr>
+      <w:rFonts w:ascii="Times New Roman" w:eastAsia="Times New Roman" w:hAnsi="Times New Roman" w:cs="Times New Roman"/>
+      <w:sz w:val="24"/>
+      <w:szCs w:val="24"/>
+      <w:lang w:eastAsia="ar-SA"/>
+    </w:rPr>
+  </w:style>
+  <w:style w:type="paragraph" w:customStyle="1" w:styleId="11C5206171604150A0F0E34E3DB6DB7C2">
+    <w:name w:val="11C5206171604150A0F0E34E3DB6DB7C2"/>
+    <w:rsid w:val="00C5361F"/>
+    <w:pPr>
+      <w:suppressAutoHyphens/>
+      <w:spacing w:after="0" w:line="240" w:lineRule="auto"/>
+    </w:pPr>
+    <w:rPr>
+      <w:rFonts w:ascii="Times New Roman" w:eastAsia="Times New Roman" w:hAnsi="Times New Roman" w:cs="Times New Roman"/>
+      <w:sz w:val="24"/>
+      <w:szCs w:val="24"/>
+      <w:lang w:eastAsia="ar-SA"/>
+    </w:rPr>
+  </w:style>
+  <w:style w:type="paragraph" w:customStyle="1" w:styleId="24D557F4BD1F4680AF94C4A8664941572">
+    <w:name w:val="24D557F4BD1F4680AF94C4A8664941572"/>
+    <w:rsid w:val="00C5361F"/>
+    <w:pPr>
+      <w:suppressAutoHyphens/>
+      <w:spacing w:after="0" w:line="240" w:lineRule="auto"/>
+    </w:pPr>
+    <w:rPr>
+      <w:rFonts w:ascii="Times New Roman" w:eastAsia="Times New Roman" w:hAnsi="Times New Roman" w:cs="Times New Roman"/>
+      <w:sz w:val="24"/>
+      <w:szCs w:val="24"/>
+      <w:lang w:eastAsia="ar-SA"/>
+    </w:rPr>
+  </w:style>
+  <w:style w:type="paragraph" w:customStyle="1" w:styleId="F2031ECA10CA432EAFAFCC13CBD26CA12">
+    <w:name w:val="F2031ECA10CA432EAFAFCC13CBD26CA12"/>
+    <w:rsid w:val="00C5361F"/>
+    <w:pPr>
+      <w:suppressAutoHyphens/>
+      <w:spacing w:after="0" w:line="240" w:lineRule="auto"/>
+    </w:pPr>
+    <w:rPr>
+      <w:rFonts w:ascii="Times New Roman" w:eastAsia="Times New Roman" w:hAnsi="Times New Roman" w:cs="Times New Roman"/>
+      <w:sz w:val="24"/>
+      <w:szCs w:val="24"/>
+      <w:lang w:eastAsia="ar-SA"/>
+    </w:rPr>
+  </w:style>
+  <w:style w:type="paragraph" w:customStyle="1" w:styleId="F6D2CF914FB545CFAF75D2C668297D5A2">
+    <w:name w:val="F6D2CF914FB545CFAF75D2C668297D5A2"/>
+    <w:rsid w:val="00C5361F"/>
+    <w:pPr>
+      <w:suppressAutoHyphens/>
+      <w:spacing w:after="0" w:line="240" w:lineRule="auto"/>
+    </w:pPr>
+    <w:rPr>
+      <w:rFonts w:ascii="Times New Roman" w:eastAsia="Times New Roman" w:hAnsi="Times New Roman" w:cs="Times New Roman"/>
+      <w:sz w:val="24"/>
+      <w:szCs w:val="24"/>
+      <w:lang w:eastAsia="ar-SA"/>
+    </w:rPr>
+  </w:style>
+  <w:style w:type="paragraph" w:customStyle="1" w:styleId="9E9A8FC7DA374C97938206616E58A5442">
+    <w:name w:val="9E9A8FC7DA374C97938206616E58A5442"/>
+    <w:rsid w:val="00C5361F"/>
+    <w:pPr>
+      <w:suppressAutoHyphens/>
+      <w:spacing w:after="0" w:line="240" w:lineRule="auto"/>
+    </w:pPr>
+    <w:rPr>
+      <w:rFonts w:ascii="Times New Roman" w:eastAsia="Times New Roman" w:hAnsi="Times New Roman" w:cs="Times New Roman"/>
+      <w:sz w:val="24"/>
+      <w:szCs w:val="24"/>
+      <w:lang w:eastAsia="ar-SA"/>
+    </w:rPr>
+  </w:style>
+  <w:style w:type="paragraph" w:customStyle="1" w:styleId="D569733F90D8465780AAFEA9A72292CC2">
+    <w:name w:val="D569733F90D8465780AAFEA9A72292CC2"/>
+    <w:rsid w:val="00C5361F"/>
+    <w:pPr>
+      <w:suppressAutoHyphens/>
+      <w:spacing w:after="0" w:line="240" w:lineRule="auto"/>
+    </w:pPr>
+    <w:rPr>
+      <w:rFonts w:ascii="Times New Roman" w:eastAsia="Times New Roman" w:hAnsi="Times New Roman" w:cs="Times New Roman"/>
+      <w:sz w:val="24"/>
+      <w:szCs w:val="24"/>
+      <w:lang w:eastAsia="ar-SA"/>
+    </w:rPr>
+  </w:style>
+  <w:style w:type="paragraph" w:customStyle="1" w:styleId="A424099D39AD4CE8A3386ED4CCAB1C512">
+    <w:name w:val="A424099D39AD4CE8A3386ED4CCAB1C512"/>
+    <w:rsid w:val="00C5361F"/>
+    <w:pPr>
+      <w:suppressAutoHyphens/>
+      <w:spacing w:after="0" w:line="240" w:lineRule="auto"/>
+    </w:pPr>
+    <w:rPr>
+      <w:rFonts w:ascii="Times New Roman" w:eastAsia="Times New Roman" w:hAnsi="Times New Roman" w:cs="Times New Roman"/>
+      <w:sz w:val="24"/>
+      <w:szCs w:val="24"/>
+      <w:lang w:eastAsia="ar-SA"/>
+    </w:rPr>
+  </w:style>
+  <w:style w:type="paragraph" w:customStyle="1" w:styleId="1C25BBCB9E8C458DB55945E1653B7B602">
+    <w:name w:val="1C25BBCB9E8C458DB55945E1653B7B602"/>
+    <w:rsid w:val="00C5361F"/>
+    <w:pPr>
+      <w:suppressAutoHyphens/>
+      <w:spacing w:after="0" w:line="240" w:lineRule="auto"/>
+    </w:pPr>
+    <w:rPr>
+      <w:rFonts w:ascii="Times New Roman" w:eastAsia="Times New Roman" w:hAnsi="Times New Roman" w:cs="Times New Roman"/>
+      <w:sz w:val="24"/>
+      <w:szCs w:val="24"/>
+      <w:lang w:eastAsia="ar-SA"/>
+    </w:rPr>
+  </w:style>
+  <w:style w:type="paragraph" w:customStyle="1" w:styleId="C4D8D8EBF8FB4F208FCCE4F22312AE582">
+    <w:name w:val="C4D8D8EBF8FB4F208FCCE4F22312AE582"/>
+    <w:rsid w:val="00C5361F"/>
+    <w:pPr>
+      <w:suppressAutoHyphens/>
+      <w:spacing w:after="0" w:line="240" w:lineRule="auto"/>
+    </w:pPr>
+    <w:rPr>
+      <w:rFonts w:ascii="Times New Roman" w:eastAsia="Times New Roman" w:hAnsi="Times New Roman" w:cs="Times New Roman"/>
+      <w:sz w:val="24"/>
+      <w:szCs w:val="24"/>
+      <w:lang w:eastAsia="ar-SA"/>
+    </w:rPr>
+  </w:style>
+  <w:style w:type="paragraph" w:customStyle="1" w:styleId="334026C924924B0F8F30D585C3574F7F2">
+    <w:name w:val="334026C924924B0F8F30D585C3574F7F2"/>
+    <w:rsid w:val="00C5361F"/>
+    <w:pPr>
+      <w:suppressAutoHyphens/>
+      <w:spacing w:after="0" w:line="240" w:lineRule="auto"/>
+    </w:pPr>
+    <w:rPr>
+      <w:rFonts w:ascii="Times New Roman" w:eastAsia="Times New Roman" w:hAnsi="Times New Roman" w:cs="Times New Roman"/>
+      <w:sz w:val="24"/>
+      <w:szCs w:val="24"/>
+      <w:lang w:eastAsia="ar-SA"/>
+    </w:rPr>
+  </w:style>
+  <w:style w:type="paragraph" w:customStyle="1" w:styleId="7ADE624015B146EC945C11081BCEF5B12">
+    <w:name w:val="7ADE624015B146EC945C11081BCEF5B12"/>
+    <w:rsid w:val="00C5361F"/>
+    <w:pPr>
+      <w:suppressAutoHyphens/>
+      <w:spacing w:after="0" w:line="240" w:lineRule="auto"/>
+    </w:pPr>
+    <w:rPr>
+      <w:rFonts w:ascii="Times New Roman" w:eastAsia="Times New Roman" w:hAnsi="Times New Roman" w:cs="Times New Roman"/>
+      <w:sz w:val="24"/>
+      <w:szCs w:val="24"/>
+      <w:lang w:eastAsia="ar-SA"/>
+    </w:rPr>
+  </w:style>
+  <w:style w:type="paragraph" w:customStyle="1" w:styleId="E25F84A56559403AB6E70300BAAE09972">
+    <w:name w:val="E25F84A56559403AB6E70300BAAE09972"/>
+    <w:rsid w:val="00C5361F"/>
+    <w:pPr>
+      <w:suppressAutoHyphens/>
+      <w:spacing w:after="0" w:line="240" w:lineRule="auto"/>
+    </w:pPr>
+    <w:rPr>
+      <w:rFonts w:ascii="Times New Roman" w:eastAsia="Times New Roman" w:hAnsi="Times New Roman" w:cs="Times New Roman"/>
+      <w:sz w:val="24"/>
+      <w:szCs w:val="24"/>
+      <w:lang w:eastAsia="ar-SA"/>
+    </w:rPr>
+  </w:style>
+  <w:style w:type="paragraph" w:customStyle="1" w:styleId="B427A4E7FE4E481ABC0FD7A111803A2A1">
+    <w:name w:val="B427A4E7FE4E481ABC0FD7A111803A2A1"/>
+    <w:rsid w:val="00C5361F"/>
+    <w:pPr>
+      <w:suppressAutoHyphens/>
+      <w:spacing w:after="0" w:line="240" w:lineRule="auto"/>
+    </w:pPr>
+    <w:rPr>
+      <w:rFonts w:ascii="Times New Roman" w:eastAsia="Times New Roman" w:hAnsi="Times New Roman" w:cs="Times New Roman"/>
+      <w:sz w:val="24"/>
+      <w:szCs w:val="24"/>
+      <w:lang w:eastAsia="ar-SA"/>
+    </w:rPr>
+  </w:style>
+  <w:style w:type="paragraph" w:customStyle="1" w:styleId="41F2BDAC22994746AACFB1BB7423863C1">
+    <w:name w:val="41F2BDAC22994746AACFB1BB7423863C1"/>
+    <w:rsid w:val="00C5361F"/>
+    <w:pPr>
+      <w:suppressAutoHyphens/>
+      <w:spacing w:after="0" w:line="240" w:lineRule="auto"/>
+    </w:pPr>
+    <w:rPr>
+      <w:rFonts w:ascii="Times New Roman" w:eastAsia="Times New Roman" w:hAnsi="Times New Roman" w:cs="Times New Roman"/>
+      <w:sz w:val="24"/>
+      <w:szCs w:val="24"/>
+      <w:lang w:eastAsia="ar-SA"/>
+    </w:rPr>
+  </w:style>
 </w:styles>
 </file>
 
@@ -12852,7 +13664,7 @@
 </file>
 
 <file path=customXml/itemProps1.xml><?xml version="1.0" encoding="utf-8"?>
-<ds:datastoreItem xmlns:ds="http://schemas.openxmlformats.org/officeDocument/2006/customXml" ds:itemID="{33F9C42C-A962-4189-8283-68247B71B70D}">
+<ds:datastoreItem xmlns:ds="http://schemas.openxmlformats.org/officeDocument/2006/customXml" ds:itemID="{1B12B382-FE81-4723-938B-330E59AAF157}">
   <ds:schemaRefs>
     <ds:schemaRef ds:uri="http://schemas.openxmlformats.org/officeDocument/2006/bibliography"/>
   </ds:schemaRefs>

</xml_diff>